<commit_message>
Verify setpoints by readback with resend on mismatch
- alicat_mfc: SendSetFlowVerified waits for status-poll setpoint readback, resends up to 10s; applies to UI, gas mixing, and pipe commands

- binder_chamber: WriteFloatVerified reads back set-point registers for temp/humidity/fan

- chamber: ChamberSerial.WriteSetpointVerified with TryReadSetpoints; UI and pipe set_temp/set_humidity use it

- yixing_chamber: YixingSerial.WriteSetTempVerified with register readback

- task_manager: delegate set_temp/set_humidity verification to chamber host, remove local retry loop

- update user manuals
</commit_message>
<xml_diff>
--- a/manual_cn.docx
+++ b/manual_cn.docx
@@ -4,28 +4,33 @@
   <w:body>
     <w:p>
       <w:pPr>
-        <w:rPr>
-          <w:rFonts w:hint="eastAsia"/>
+        <w:jc w:val="center"/>
+        <w:rPr>
+          <w:sz w:val="36"/>
+          <w:szCs w:val="36"/>
         </w:rPr>
       </w:pPr>
       <w:r>
         <w:rPr>
           <w:rFonts w:hint="eastAsia"/>
+          <w:sz w:val="36"/>
+          <w:szCs w:val="36"/>
         </w:rPr>
         <w:t>自动化测试软件使用指南</w:t>
       </w:r>
     </w:p>
     <w:p>
-      <w:pPr>
-        <w:rPr>
-          <w:rFonts w:hint="eastAsia"/>
-        </w:rPr>
-      </w:pPr>
-      <w:r>
-        <w:rPr>
-          <w:rFonts w:hint="eastAsia"/>
-        </w:rPr>
-        <w:t>第一步，</w:t>
+      <w:r>
+        <w:rPr>
+          <w:rFonts w:hint="eastAsia"/>
+        </w:rPr>
+        <w:t>首先</w:t>
+      </w:r>
+      <w:r>
+        <w:rPr>
+          <w:rFonts w:hint="eastAsia"/>
+        </w:rPr>
+        <w:t>，</w:t>
       </w:r>
       <w:r>
         <w:rPr>
@@ -231,6 +236,53 @@
       </w:r>
     </w:p>
     <w:p>
+      <w:r>
+        <w:rPr>
+          <w:rFonts w:hint="eastAsia"/>
+        </w:rPr>
+        <w:t>Task manager负责连接和控制MFC和chamber（环境控制）</w:t>
+      </w:r>
+    </w:p>
+    <w:p/>
+    <w:p>
+      <w:r>
+        <w:rPr>
+          <w:rFonts w:hint="eastAsia"/>
+        </w:rPr>
+        <w:t>然后编辑 task list</w:t>
+      </w:r>
+      <w:r>
+        <w:rPr>
+          <w:rFonts w:hint="eastAsia"/>
+        </w:rPr>
+        <w:t>：（如果你有传感器测试的工作经验，你会很容易理解task list的内容</w:t>
+      </w:r>
+      <w:r>
+        <w:rPr>
+          <w:rFonts w:hint="eastAsia"/>
+        </w:rPr>
+        <w:t>，然后自己</w:t>
+      </w:r>
+      <w:r>
+        <w:rPr>
+          <w:rFonts w:hint="eastAsia"/>
+        </w:rPr>
+        <w:t>编辑task list</w:t>
+      </w:r>
+      <w:r>
+        <w:rPr>
+          <w:rFonts w:hint="eastAsia"/>
+        </w:rPr>
+        <w:t>。任务顺序和常规测试流程一样</w:t>
+      </w:r>
+      <w:r>
+        <w:rPr>
+          <w:rFonts w:hint="eastAsia"/>
+        </w:rPr>
+        <w:t>）</w:t>
+      </w:r>
+    </w:p>
+    <w:p>
       <w:pPr>
         <w:rPr>
           <w:rFonts w:hint="eastAsia"/>
@@ -240,16 +292,88 @@
         <w:rPr>
           <w:rFonts w:hint="eastAsia"/>
         </w:rPr>
-        <w:t>Task manager负责连接和控制MFC和chamber（环境控制）</w:t>
-      </w:r>
-    </w:p>
-    <w:p>
+        <w:t>例如：</w:t>
+      </w:r>
+      <w:r>
+        <w:rPr>
+          <w:rFonts w:hint="eastAsia"/>
+          <w:color w:val="EE0000"/>
+        </w:rPr>
+        <w:t>测试40度下的</w:t>
+      </w:r>
+      <w:proofErr w:type="gramStart"/>
+      <w:r>
+        <w:rPr>
+          <w:rFonts w:hint="eastAsia"/>
+          <w:color w:val="EE0000"/>
+        </w:rPr>
+        <w:t>线性:</w:t>
+      </w:r>
+      <w:proofErr w:type="gramEnd"/>
+      <w:r>
+        <w:br/>
+      </w:r>
+      <w:r>
+        <w:rPr>
+          <w:rFonts w:hint="eastAsia"/>
+        </w:rPr>
+        <w:t>先将 chamber 的温度设定到-40°，然后保持两个小时，让 chamber 舱内温度降低到-40°，控制MFC，连续通</w:t>
+      </w:r>
+      <w:proofErr w:type="gramStart"/>
+      <w:r>
+        <w:rPr>
+          <w:rFonts w:hint="eastAsia"/>
+        </w:rPr>
+        <w:t>入 100</w:t>
+      </w:r>
+      <w:proofErr w:type="gramEnd"/>
+      <w:r>
+        <w:rPr>
+          <w:rFonts w:hint="eastAsia"/>
+        </w:rPr>
+        <w:t>、200、300、400、</w:t>
+      </w:r>
+      <w:proofErr w:type="gramStart"/>
+      <w:r>
+        <w:rPr>
+          <w:rFonts w:hint="eastAsia"/>
+        </w:rPr>
+        <w:t>500 浓度</w:t>
+      </w:r>
+      <w:proofErr w:type="gramEnd"/>
+      <w:r>
+        <w:rPr>
+          <w:rFonts w:hint="eastAsia"/>
+        </w:rPr>
+        <w:t>的目标气体，每次通气</w:t>
+      </w:r>
+      <w:proofErr w:type="gramStart"/>
+      <w:r>
+        <w:rPr>
+          <w:rFonts w:hint="eastAsia"/>
+        </w:rPr>
+        <w:t xml:space="preserve">保持 5 </w:t>
+      </w:r>
+      <w:proofErr w:type="gramEnd"/>
+      <w:r>
+        <w:rPr>
+          <w:rFonts w:hint="eastAsia"/>
+        </w:rPr>
+        <w:t>分钟。测试完成后，将MFC流量全部设置为0，并将chamber温度设置为20°，等待chamber回到20°，然后关闭chamber。</w:t>
+      </w:r>
+    </w:p>
+    <w:p>
+      <w:pPr>
+        <w:rPr>
+          <w:rFonts w:hint="eastAsia"/>
+        </w:rPr>
+      </w:pPr>
       <w:r>
         <w:rPr>
           <w:noProof/>
         </w:rPr>
         <w:drawing>
-          <wp:inline distT="0" distB="0" distL="0" distR="0" wp14:anchorId="46C85C95" wp14:editId="4726F01C">
+          <wp:inline distT="0" distB="0" distL="0" distR="0" wp14:anchorId="4832FF9A" wp14:editId="4ADE8E6A">
             <wp:extent cx="5274310" cy="5260340"/>
             <wp:effectExtent l="0" t="0" r="2540" b="0"/>
             <wp:docPr id="2014694029" name="图片 1"/>
@@ -290,61 +414,200 @@
         <w:rPr>
           <w:rFonts w:hint="eastAsia"/>
         </w:rPr>
-        <w:t>然后编辑 task list，例如上图：先将 chamber 的温度设定到-40°，然后保持两个小时，让 chamber 舱内温度降低到-40°，控制MFC，连续通</w:t>
+        <w:t>配置好以后，我们可以点击 export config按钮，将当前配置和task list保存为一个</w:t>
+      </w:r>
+      <w:r>
+        <w:rPr>
+          <w:rFonts w:hint="eastAsia"/>
+        </w:rPr>
+        <w:lastRenderedPageBreak/>
+        <w:t>Json文件，方便下次点击Load config加载。</w:t>
+      </w:r>
+    </w:p>
+    <w:p/>
+    <w:p>
+      <w:pPr>
+        <w:rPr>
+          <w:rFonts w:hint="eastAsia"/>
+        </w:rPr>
+      </w:pPr>
+      <w:r>
+        <w:rPr>
+          <w:rFonts w:hint="eastAsia"/>
+        </w:rPr>
+        <w:t>例如：</w:t>
+      </w:r>
+      <w:r>
+        <w:rPr>
+          <w:rFonts w:hint="eastAsia"/>
+          <w:color w:val="EE0000"/>
+        </w:rPr>
+        <w:t>测试T90和重复性</w:t>
       </w:r>
       <w:proofErr w:type="gramStart"/>
       <w:r>
         <w:rPr>
           <w:rFonts w:hint="eastAsia"/>
         </w:rPr>
-        <w:t>入 100</w:t>
+        <w:t>(这两个指标通常可以</w:t>
+      </w:r>
+      <w:r>
+        <w:rPr>
+          <w:rFonts w:hint="eastAsia"/>
+        </w:rPr>
+        <w:t>一起测</w:t>
+      </w:r>
+      <w:r>
+        <w:rPr>
+          <w:rFonts w:hint="eastAsia"/>
+        </w:rPr>
+        <w:t>)</w:t>
       </w:r>
       <w:proofErr w:type="gramEnd"/>
       <w:r>
-        <w:rPr>
-          <w:rFonts w:hint="eastAsia"/>
-        </w:rPr>
-        <w:t>、200、300、400、</w:t>
-      </w:r>
-      <w:proofErr w:type="gramStart"/>
-      <w:r>
-        <w:rPr>
-          <w:rFonts w:hint="eastAsia"/>
-        </w:rPr>
-        <w:t>500 浓度</w:t>
-      </w:r>
-      <w:proofErr w:type="gramEnd"/>
-      <w:r>
-        <w:rPr>
-          <w:rFonts w:hint="eastAsia"/>
-        </w:rPr>
-        <w:t>的目标气体，每次通气</w:t>
-      </w:r>
-      <w:proofErr w:type="gramStart"/>
-      <w:r>
-        <w:rPr>
-          <w:rFonts w:hint="eastAsia"/>
-        </w:rPr>
-        <w:t xml:space="preserve">保持 5 </w:t>
-      </w:r>
-      <w:proofErr w:type="gramEnd"/>
-      <w:r>
-        <w:rPr>
-          <w:rFonts w:hint="eastAsia"/>
-        </w:rPr>
-        <w:t>分钟。测试完成后，将MFC流量全部设置为0，并将chamber温度设置为20°，等待chamber回到20°，然后关闭chamber。</w:t>
-      </w:r>
-    </w:p>
-    <w:p>
-      <w:r>
-        <w:rPr>
-          <w:rFonts w:hint="eastAsia"/>
-        </w:rPr>
-        <w:t>当我们把一切都配置好以后，我们可以点击 export config按钮，将当前配置和task list保存为一个Json文件，方便下次点击Load config加载。</w:t>
+        <w:br/>
+      </w:r>
+      <w:r>
+        <w:rPr>
+          <w:rFonts w:hint="eastAsia"/>
+        </w:rPr>
+        <w:t>如下图：通目标气体4分钟，然后通背景气体4分钟，重复多次，最后关闭气体</w:t>
+      </w:r>
+    </w:p>
+    <w:p>
+      <w:r>
+        <w:rPr>
+          <w:noProof/>
+        </w:rPr>
+        <w:drawing>
+          <wp:inline distT="0" distB="0" distL="0" distR="0" wp14:anchorId="2528377C" wp14:editId="0F54D56A">
+            <wp:extent cx="5274310" cy="5631815"/>
+            <wp:effectExtent l="0" t="0" r="2540" b="6985"/>
+            <wp:docPr id="720298663" name="图片 1"/>
+            <wp:cNvGraphicFramePr>
+              <a:graphicFrameLocks xmlns:a="http://schemas.openxmlformats.org/drawingml/2006/main" noChangeAspect="1"/>
+            </wp:cNvGraphicFramePr>
+            <a:graphic xmlns:a="http://schemas.openxmlformats.org/drawingml/2006/main">
+              <a:graphicData uri="http://schemas.openxmlformats.org/drawingml/2006/picture">
+                <pic:pic xmlns:pic="http://schemas.openxmlformats.org/drawingml/2006/picture">
+                  <pic:nvPicPr>
+                    <pic:cNvPr id="720298663" name=""/>
+                    <pic:cNvPicPr/>
+                  </pic:nvPicPr>
+                  <pic:blipFill>
+                    <a:blip r:embed="rId7"/>
+                    <a:stretch>
+                      <a:fillRect/>
+                    </a:stretch>
+                  </pic:blipFill>
+                  <pic:spPr>
+                    <a:xfrm>
+                      <a:off x="0" y="0"/>
+                      <a:ext cx="5274310" cy="5631815"/>
+                    </a:xfrm>
+                    <a:prstGeom prst="rect">
+                      <a:avLst/>
+                    </a:prstGeom>
+                  </pic:spPr>
+                </pic:pic>
+              </a:graphicData>
+            </a:graphic>
+          </wp:inline>
+        </w:drawing>
       </w:r>
     </w:p>
     <w:p/>
     <w:p>
+      <w:pPr>
+        <w:rPr>
+          <w:rFonts w:hint="eastAsia"/>
+        </w:rPr>
+      </w:pPr>
+      <w:r>
+        <w:rPr>
+          <w:rFonts w:hint="eastAsia"/>
+        </w:rPr>
+        <w:t>举例：</w:t>
+      </w:r>
+      <w:r>
+        <w:rPr>
+          <w:rFonts w:hint="eastAsia"/>
+          <w:color w:val="EE0000"/>
+        </w:rPr>
+        <w:t>温度补偿</w:t>
+      </w:r>
+      <w:r>
+        <w:rPr>
+          <w:rFonts w:hint="eastAsia"/>
+          <w:color w:val="EE0000"/>
+        </w:rPr>
+        <w:t>测试</w:t>
+      </w:r>
+      <w:r>
+        <w:rPr>
+          <w:rFonts w:hint="eastAsia"/>
+        </w:rPr>
+        <w:t>：</w:t>
+      </w:r>
+      <w:r>
+        <w:br/>
+      </w:r>
+      <w:r>
+        <w:rPr>
+          <w:rFonts w:hint="eastAsia"/>
+        </w:rPr>
+        <w:t>chamber温度设为-40度，然后通入特定浓度的目标气体240秒，再通入背景气体240秒让浓度下降。然后设置下一个温度点-20度，继续重复上述步骤，直到把所有温度点全部测完。</w:t>
+      </w:r>
+    </w:p>
+    <w:p>
+      <w:pPr>
+        <w:rPr>
+          <w:rFonts w:hint="eastAsia"/>
+        </w:rPr>
+      </w:pPr>
+      <w:r>
+        <w:rPr>
+          <w:noProof/>
+        </w:rPr>
+        <w:lastRenderedPageBreak/>
+        <w:drawing>
+          <wp:inline distT="0" distB="0" distL="0" distR="0" wp14:anchorId="6E073EDB" wp14:editId="4937A385">
+            <wp:extent cx="5274310" cy="5631815"/>
+            <wp:effectExtent l="0" t="0" r="2540" b="6985"/>
+            <wp:docPr id="1686961654" name="图片 1"/>
+            <wp:cNvGraphicFramePr>
+              <a:graphicFrameLocks xmlns:a="http://schemas.openxmlformats.org/drawingml/2006/main" noChangeAspect="1"/>
+            </wp:cNvGraphicFramePr>
+            <a:graphic xmlns:a="http://schemas.openxmlformats.org/drawingml/2006/main">
+              <a:graphicData uri="http://schemas.openxmlformats.org/drawingml/2006/picture">
+                <pic:pic xmlns:pic="http://schemas.openxmlformats.org/drawingml/2006/picture">
+                  <pic:nvPicPr>
+                    <pic:cNvPr id="1686961654" name=""/>
+                    <pic:cNvPicPr/>
+                  </pic:nvPicPr>
+                  <pic:blipFill>
+                    <a:blip r:embed="rId8"/>
+                    <a:stretch>
+                      <a:fillRect/>
+                    </a:stretch>
+                  </pic:blipFill>
+                  <pic:spPr>
+                    <a:xfrm>
+                      <a:off x="0" y="0"/>
+                      <a:ext cx="5274310" cy="5631815"/>
+                    </a:xfrm>
+                    <a:prstGeom prst="rect">
+                      <a:avLst/>
+                    </a:prstGeom>
+                  </pic:spPr>
+                </pic:pic>
+              </a:graphicData>
+            </a:graphic>
+          </wp:inline>
+        </w:drawing>
+      </w:r>
+    </w:p>
+    <w:p>
       <w:r>
         <w:rPr>
           <w:rFonts w:hint="eastAsia"/>
@@ -353,11 +616,6 @@
       </w:r>
     </w:p>
     <w:p>
-      <w:pPr>
-        <w:rPr>
-          <w:rFonts w:hint="eastAsia"/>
-        </w:rPr>
-      </w:pPr>
       <w:r>
         <w:rPr>
           <w:rFonts w:hint="eastAsia"/>
@@ -376,14 +634,7 @@
         <w:rPr>
           <w:rFonts w:hint="eastAsia"/>
         </w:rPr>
-        <w:t xml:space="preserve">测试板，确保填写了正确的 </w:t>
-      </w:r>
-      <w:r>
-        <w:rPr>
-          <w:rFonts w:hint="eastAsia"/>
-        </w:rPr>
-        <w:lastRenderedPageBreak/>
-        <w:t>task manager pipe name</w:t>
+        <w:t>测试板，确保填写了正确的 task manager pipe name</w:t>
       </w:r>
       <w:r>
         <w:rPr>
@@ -413,7 +664,7 @@
                     <pic:cNvPicPr/>
                   </pic:nvPicPr>
                   <pic:blipFill>
-                    <a:blip r:embed="rId7"/>
+                    <a:blip r:embed="rId9"/>
                     <a:stretch>
                       <a:fillRect/>
                     </a:stretch>
@@ -461,6 +712,7 @@
         <w:rPr>
           <w:rFonts w:hint="eastAsia"/>
         </w:rPr>
+        <w:lastRenderedPageBreak/>
         <w:t>然后打开Task Manager，点击start按钮开始执行task list里的任务，现在你就可以去做别的事情，等待任务运行完。</w:t>
       </w:r>
     </w:p>
@@ -516,7 +768,7 @@
                     </pic:cNvPicPr>
                   </pic:nvPicPr>
                   <pic:blipFill rotWithShape="1">
-                    <a:blip r:embed="rId8" cstate="print">
+                    <a:blip r:embed="rId10" cstate="print">
                       <a:extLst>
                         <a:ext uri="{28A0092B-C50C-407E-A947-70E740481C1C}">
                           <a14:useLocalDpi xmlns:a14="http://schemas.microsoft.com/office/drawing/2010/main" val="0"/>
@@ -646,6 +898,62 @@
           <w:rFonts w:hint="eastAsia"/>
         </w:rPr>
       </w:pPr>
+      <w:r>
+        <w:rPr>
+          <w:rFonts w:hint="eastAsia"/>
+        </w:rPr>
+        <w:t>最后将这个csv表格发送给AI agent（</w:t>
+      </w:r>
+      <w:r>
+        <w:rPr>
+          <w:rFonts w:hint="eastAsia"/>
+        </w:rPr>
+        <w:t>C</w:t>
+      </w:r>
+      <w:r>
+        <w:rPr>
+          <w:rFonts w:hint="eastAsia"/>
+        </w:rPr>
+        <w:t>odex，</w:t>
+      </w:r>
+      <w:r>
+        <w:rPr>
+          <w:rFonts w:hint="eastAsia"/>
+        </w:rPr>
+        <w:t>C</w:t>
+      </w:r>
+      <w:r>
+        <w:rPr>
+          <w:rFonts w:hint="eastAsia"/>
+        </w:rPr>
+        <w:t>laude</w:t>
+      </w:r>
+      <w:r>
+        <w:rPr>
+          <w:rFonts w:hint="eastAsia"/>
+        </w:rPr>
+        <w:t>等</w:t>
+      </w:r>
+      <w:r>
+        <w:rPr>
+          <w:rFonts w:hint="eastAsia"/>
+        </w:rPr>
+        <w:t>）让AI辅助分析并计算T90，线性，重复性，温度</w:t>
+      </w:r>
+      <w:proofErr w:type="gramStart"/>
+      <w:r>
+        <w:rPr>
+          <w:rFonts w:hint="eastAsia"/>
+        </w:rPr>
+        <w:t>补偿 等</w:t>
+      </w:r>
+      <w:proofErr w:type="gramEnd"/>
+      <w:r>
+        <w:rPr>
+          <w:rFonts w:hint="eastAsia"/>
+        </w:rPr>
+        <w:t>性能指标。</w:t>
+      </w:r>
     </w:p>
     <w:sectPr>
       <w:pgSz w:w="11906" w:h="16838"/>

</xml_diff>